<commit_message>
Refactor management fee calculation components; update field names and report structure
</commit_message>
<xml_diff>
--- a/ManagementFeeCalculation.docx
+++ b/ManagementFeeCalculation.docx
@@ -502,18 +502,18 @@
         <w:tblLook w:val="04A0" w:firstRow="1" w:lastRow="0" w:firstColumn="1" w:lastColumn="0" w:noHBand="0" w:noVBand="1"/>
       </w:tblPr>
       <w:tblGrid>
-        <w:gridCol w:w="2092"/>
-        <w:gridCol w:w="1574"/>
-        <w:gridCol w:w="1093"/>
-        <w:gridCol w:w="1025"/>
-        <w:gridCol w:w="1338"/>
-        <w:gridCol w:w="1428"/>
-        <w:gridCol w:w="1160"/>
-        <w:gridCol w:w="831"/>
-        <w:gridCol w:w="674"/>
-        <w:gridCol w:w="1433"/>
-        <w:gridCol w:w="989"/>
-        <w:gridCol w:w="1578"/>
+        <w:gridCol w:w="2146"/>
+        <w:gridCol w:w="1613"/>
+        <w:gridCol w:w="1119"/>
+        <w:gridCol w:w="1049"/>
+        <w:gridCol w:w="1371"/>
+        <w:gridCol w:w="1464"/>
+        <w:gridCol w:w="1187"/>
+        <w:gridCol w:w="849"/>
+        <w:gridCol w:w="687"/>
+        <w:gridCol w:w="1469"/>
+        <w:gridCol w:w="1012"/>
+        <w:gridCol w:w="1249"/>
       </w:tblGrid>
       <w:tr>
         <w:tc>
@@ -1317,13 +1317,13 @@
               <w:b/>
               <w:bCs/>
             </w:rPr>
-            <w:id w:val="-2117206480"/>
+            <w:id w:val="310534627"/>
             <w:placeholder>
               <w:docPart w:val="DefaultPlaceholder_-1854013440"/>
             </w:placeholder>
-            <w:dataBinding w:prefixMappings="xmlns:ns0='urn:microsoft-dynamics-nav/reports/Management_Fee_Calculation/50119/' " w:xpath="/ns0:NavWordReportXmlPart[1]/ns0:Management_Fee_Calc_Header[1]/ns0:Total_Management_Fee[1]" w:storeItemID="{F525D34B-9F89-4FBE-9311-0F7E641D4220}"/>
+            <w:dataBinding w:prefixMappings="xmlns:ns0='urn:microsoft-dynamics-nav/reports/Management_Fee_Calculation/50119/' " w:xpath="/ns0:NavWordReportXmlPart[1]/ns0:Management_Fee_Calc_Header[1]/ns0:Management_Fee_Calc_Line[1]/ns0:Total_Mgt__Fee[1]" w:storeItemID="{F525D34B-9F89-4FBE-9311-0F7E641D4220}"/>
             <w:text/>
-            <w:alias w:val="#Nav: /Management_Fee_Calc_Header/Total_Management_Fee"/>
+            <w:alias w:val="#Nav: /Management_Fee_Calc_Header/Management_Fee_Calc_Line/Total_Mgt__Fee"/>
             <w:tag w:val="#Nav: Management_Fee_Calculation/50119"/>
           </w:sdtPr>
           <w:sdtContent>
@@ -1346,7 +1346,7 @@
                     <w:b/>
                     <w:bCs/>
                   </w:rPr>
-                  <w:t>Total_Management_Fee</w:t>
+                  <w:t>Total_Mgt__Fee</w:t>
                 </w:r>
                 <w:proofErr w:type="spellEnd"/>
               </w:p>
@@ -2336,14 +2336,18 @@
     <w:rsid w:val="006B1911"/>
     <w:rsid w:val="007F4B30"/>
     <w:rsid w:val="007F5399"/>
+    <w:rsid w:val="009155D5"/>
     <w:rsid w:val="0099227A"/>
+    <w:rsid w:val="00A514EC"/>
     <w:rsid w:val="00B6268F"/>
     <w:rsid w:val="00B75954"/>
+    <w:rsid w:val="00BA5E39"/>
     <w:rsid w:val="00C5127F"/>
     <w:rsid w:val="00C920C3"/>
     <w:rsid w:val="00D057BD"/>
     <w:rsid w:val="00D35555"/>
     <w:rsid w:val="00D84470"/>
+    <w:rsid w:val="00FB4AD2"/>
   </w:rsids>
   <m:mathPr>
     <m:mathFont m:val="Cambria Math"/>
@@ -3227,6 +3231,8 @@
  
              < P r o p e r t y _ T y p e > P r o p e r t y _ T y p e < / P r o p e r t y _ T y p e >   
+             < T o t a l _ M g t _ _ F e e > T o t a l _ M g t _ _ F e e < / T o t a l _ M g t _ _ F e e > + 
              < V a l i d i t y _ P e r i o d > V a l i d i t y _ P e r i o d < / V a l i d i t y _ P e r i o d >   
          < / M a n a g e m e n t _ F e e _ C a l c _ L i n e > @@ -3347,6 +3353,8 @@
              < P r o p e r t y _ N a m e   E l e m e n t T y p e = " C o l u m n "   E l e m e n t I d = " 1 2 9 1 8 2 3 7 9 8 "   D a t a T y p e = " T e x t " > P r o p e r t y _ N a m e < / P r o p e r t y _ N a m e >   
              < P r o p e r t y _ T y p e   E l e m e n t T y p e = " C o l u m n "   E l e m e n t I d = " 1 2 4 5 0 9 6 0 7 5 "   D a t a T y p e = " T e x t " > P r o p e r t y _ T y p e < / P r o p e r t y _ T y p e > + 
+             < T o t a l _ M g t _ _ F e e   E l e m e n t T y p e = " C o l u m n "   E l e m e n t I d = " 1 8 2 9 8 2 7 1 0 4 "   D a t a T y p e = " D e c i m a l " > T o t a l _ M g t _ _ F e e < / T o t a l _ M g t _ _ F e e >   
              < V a l i d i t y _ P e r i o d   E l e m e n t T y p e = " C o l u m n "   E l e m e n t I d = " 1 0 6 3 4 8 5 8 4 3 "   D a t a T y p e = " T e x t " > V a l i d i t y _ P e r i o d < / V a l i d i t y _ P e r i o d >   

</xml_diff>